<commit_message>
Add demonstration video link
</commit_message>
<xml_diff>
--- a/weatherdashboard/Weather Dashboard Project Documentation.docx
+++ b/weatherdashboard/Weather Dashboard Project Documentation.docx
@@ -80,13 +80,11 @@
         <w:jc w:val="center"/>
         <w:rPr>
           <w:rFonts w:ascii="Times New Roman" w:hAnsi="Times New Roman" w:cs="Times New Roman"/>
-          <w:lang w:val="es-CU"/>
         </w:rPr>
       </w:pPr>
       <w:r>
         <w:rPr>
           <w:rFonts w:ascii="Times New Roman" w:hAnsi="Times New Roman" w:cs="Times New Roman"/>
-          <w:lang w:val="es-CU"/>
         </w:rPr>
         <w:t>Pablo Gallardo</w:t>
       </w:r>
@@ -103,13 +101,7 @@
         <w:rPr>
           <w:rFonts w:ascii="Times New Roman" w:hAnsi="Times New Roman" w:cs="Times New Roman"/>
         </w:rPr>
-        <w:t xml:space="preserve">COP 2800 - </w:t>
-      </w:r>
-      <w:r>
-        <w:rPr>
-          <w:rFonts w:ascii="Times New Roman" w:hAnsi="Times New Roman" w:cs="Times New Roman"/>
-        </w:rPr>
-        <w:t>Java Programming</w:t>
+        <w:t>COP 2800 - Java Programming</w:t>
       </w:r>
       <w:r>
         <w:rPr>
@@ -2202,14 +2194,16 @@
         </w:rPr>
         <w:t xml:space="preserve">YouTube demonstration: </w:t>
       </w:r>
-      <w:r>
-        <w:rPr>
-          <w:rFonts w:ascii="Times New Roman" w:hAnsi="Times New Roman" w:cs="Times New Roman"/>
-          <w:i/>
-          <w:color w:val="9C6900"/>
-        </w:rPr>
-        <w:t>To be added after the demonstration video is recorded.</w:t>
-      </w:r>
+      <w:hyperlink r:id="rIdVideo1">
+        <w:r>
+          <w:rPr>
+            <w:rFonts w:ascii="Times New Roman" w:hAnsi="Times New Roman" w:cs="Times New Roman"/>
+            <w:color w:val="0563C1"/>
+            <w:u w:val="single"/>
+          </w:rPr>
+          <w:t>Watch the Weather Dashboard demonstration</w:t>
+        </w:r>
+      </w:hyperlink>
     </w:p>
     <w:p>
       <w:pPr>
@@ -2241,7 +2235,20 @@
         <w:rPr>
           <w:rFonts w:ascii="Times New Roman" w:hAnsi="Times New Roman" w:cs="Times New Roman"/>
         </w:rPr>
-        <w:t>AI tools were used as a development assistant for planning, troubleshooting, interface ideas, documentation, and test suggestions. I reviewed the code, tested the application, and made the final feature and design decisions.</w:t>
+        <w:t>Codex AI was used as a development assistant throughout this project. It helped explain JavaFX and Maven setup, suggest the database structure, troubleshoot errors, improve parts of the user interface, and develop additional JUnit tests. It was also used to organize the README and project documentation.</w:t>
+      </w:r>
+    </w:p>
+    <w:p>
+      <w:pPr>
+        <w:rPr>
+          <w:rFonts w:ascii="Times New Roman" w:hAnsi="Times New Roman" w:cs="Times New Roman"/>
+        </w:rPr>
+      </w:pPr>
+      <w:r>
+        <w:rPr>
+          <w:rFonts w:ascii="Times New Roman" w:hAnsi="Times New Roman" w:cs="Times New Roman"/>
+        </w:rPr>
+        <w:t>I reviewed the suggested code, tested each feature, and made the final decisions about the application’s design and functionality. When errors occurred, I used the error messages and Codex’s explanations to understand the cause and correct the problem. This helped me learn more about JavaFX controllers, FXML, SQLite, API requests, exception handling, and project organization.</w:t>
       </w:r>
     </w:p>
     <w:p>
@@ -2371,6 +2378,7 @@
           <w:bCs/>
           <w:color w:val="00B050"/>
         </w:rPr>
+        <w:lastRenderedPageBreak/>
         <w:t>15. Data and Design Credits</w:t>
       </w:r>
     </w:p>
@@ -2509,14 +2517,7 @@
         <w:color w:val="5C6670"/>
         <w:sz w:val="18"/>
       </w:rPr>
-      <w:t>Page</w:t>
-    </w:r>
-    <w:r>
-      <w:rPr>
-        <w:color w:val="5C6670"/>
-        <w:sz w:val="18"/>
-      </w:rPr>
-      <w:t xml:space="preserve"> </w:t>
+      <w:t xml:space="preserve">Page </w:t>
     </w:r>
     <w:r>
       <w:rPr>
@@ -3396,7 +3397,6 @@
   <w:style w:type="character" w:default="1" w:styleId="DefaultParagraphFont">
     <w:name w:val="Default Paragraph Font"/>
     <w:uiPriority w:val="1"/>
-    <w:semiHidden/>
     <w:unhideWhenUsed/>
   </w:style>
   <w:style w:type="table" w:default="1" w:styleId="TableNormal">

</xml_diff>